<commit_message>
Aufgaben 3 und 4
</commit_message>
<xml_diff>
--- a/XBegleitdokument.docx
+++ b/XBegleitdokument.docx
@@ -12,37 +12,622 @@
         <w:rPr>
           <w:lang w:val="en-GB"/>
         </w:rPr>
-        <w:t xml:space="preserve">1.3 Design </w:t>
-      </w:r>
+        <w:t xml:space="preserve">Aufgabe </w:t>
+      </w:r>
+      <w:r>
+        <w:rPr>
+          <w:lang w:val="en-GB"/>
+        </w:rPr>
+        <w:t>3</w:t>
+      </w:r>
+      <w:r>
+        <w:rPr>
+          <w:lang w:val="en-GB"/>
+        </w:rPr>
+        <w:t xml:space="preserve"> </w:t>
+      </w:r>
+      <w:proofErr w:type="spellStart"/>
+      <w:r>
+        <w:rPr>
+          <w:lang w:val="en-GB"/>
+        </w:rPr>
+        <w:t>LocalStorage</w:t>
+      </w:r>
+      <w:proofErr w:type="spellEnd"/>
     </w:p>
     <w:p>
       <w:pPr>
         <w:rPr>
-          <w:lang w:val="en-GB"/>
-        </w:rPr>
-      </w:pPr>
-      <w:r>
-        <w:rPr>
-          <w:lang w:val="en-GB"/>
-        </w:rPr>
-        <w:t>Inspiration: List Ease</w:t>
+          <w:lang w:val="de-DE"/>
+        </w:rPr>
+      </w:pPr>
+      <w:r>
+        <w:rPr>
+          <w:lang w:val="de-DE"/>
+        </w:rPr>
+        <w:t>In unserem Projekt haben wir k</w:t>
+      </w:r>
+      <w:r>
+        <w:rPr>
+          <w:lang w:val="de-DE"/>
+        </w:rPr>
+        <w:t xml:space="preserve">einen eigenen </w:t>
+      </w:r>
+      <w:proofErr w:type="spellStart"/>
+      <w:r>
+        <w:rPr>
+          <w:lang w:val="de-DE"/>
+        </w:rPr>
+        <w:t>useLocalStorage</w:t>
+      </w:r>
+      <w:proofErr w:type="spellEnd"/>
+      <w:r>
+        <w:rPr>
+          <w:lang w:val="de-DE"/>
+        </w:rPr>
+        <w:t xml:space="preserve">-Hook, sondern die zwei Funktionen </w:t>
+      </w:r>
+      <w:proofErr w:type="spellStart"/>
+      <w:proofErr w:type="gramStart"/>
+      <w:r>
+        <w:rPr>
+          <w:lang w:val="de-DE"/>
+        </w:rPr>
+        <w:t>loadState</w:t>
+      </w:r>
+      <w:proofErr w:type="spellEnd"/>
+      <w:r>
+        <w:rPr>
+          <w:lang w:val="de-DE"/>
+        </w:rPr>
+        <w:t>(</w:t>
+      </w:r>
+      <w:proofErr w:type="gramEnd"/>
+      <w:r>
+        <w:rPr>
+          <w:lang w:val="de-DE"/>
+        </w:rPr>
+        <w:t xml:space="preserve">) und </w:t>
+      </w:r>
+      <w:proofErr w:type="spellStart"/>
+      <w:proofErr w:type="gramStart"/>
+      <w:r>
+        <w:rPr>
+          <w:lang w:val="de-DE"/>
+        </w:rPr>
+        <w:t>saveState</w:t>
+      </w:r>
+      <w:proofErr w:type="spellEnd"/>
+      <w:r>
+        <w:rPr>
+          <w:lang w:val="de-DE"/>
+        </w:rPr>
+        <w:t>(</w:t>
+      </w:r>
+      <w:proofErr w:type="gramEnd"/>
+      <w:r>
+        <w:rPr>
+          <w:lang w:val="de-DE"/>
+        </w:rPr>
+        <w:t xml:space="preserve">) in storage.js. Wenn der App gestartet wird, wird </w:t>
+      </w:r>
+      <w:proofErr w:type="spellStart"/>
+      <w:proofErr w:type="gramStart"/>
+      <w:r>
+        <w:rPr>
+          <w:lang w:val="de-DE"/>
+        </w:rPr>
+        <w:t>loadState</w:t>
+      </w:r>
+      <w:proofErr w:type="spellEnd"/>
+      <w:r>
+        <w:rPr>
+          <w:lang w:val="de-DE"/>
+        </w:rPr>
+        <w:t>(</w:t>
+      </w:r>
+      <w:proofErr w:type="gramEnd"/>
+      <w:r>
+        <w:rPr>
+          <w:lang w:val="de-DE"/>
+        </w:rPr>
+        <w:t xml:space="preserve">) die gespeicherte Einkaufliste aus dem </w:t>
+      </w:r>
+      <w:proofErr w:type="spellStart"/>
+      <w:r>
+        <w:rPr>
+          <w:lang w:val="de-DE"/>
+        </w:rPr>
+        <w:t>localStorage</w:t>
+      </w:r>
+      <w:proofErr w:type="spellEnd"/>
+      <w:r>
+        <w:rPr>
+          <w:lang w:val="de-DE"/>
+        </w:rPr>
+        <w:t xml:space="preserve"> geladen. Dabei wird der Schlüssel „groceries-app-v1“ verwendet. </w:t>
       </w:r>
     </w:p>
     <w:p>
       <w:pPr>
         <w:rPr>
-          <w:lang w:val="en-GB"/>
-        </w:rPr>
-      </w:pPr>
-      <w:r>
-        <w:rPr>
-          <w:lang w:val="en-GB"/>
+          <w:lang w:val="de-DE"/>
+        </w:rPr>
+      </w:pPr>
+      <w:r>
+        <w:rPr>
+          <w:lang w:val="de-DE"/>
+        </w:rPr>
+        <w:t xml:space="preserve">Beim Speichern wird </w:t>
+      </w:r>
+      <w:proofErr w:type="spellStart"/>
+      <w:proofErr w:type="gramStart"/>
+      <w:r>
+        <w:rPr>
+          <w:lang w:val="de-DE"/>
+        </w:rPr>
+        <w:t>saveState</w:t>
+      </w:r>
+      <w:proofErr w:type="spellEnd"/>
+      <w:r>
+        <w:rPr>
+          <w:lang w:val="de-DE"/>
+        </w:rPr>
+        <w:t>(</w:t>
+      </w:r>
+      <w:proofErr w:type="spellStart"/>
+      <w:proofErr w:type="gramEnd"/>
+      <w:r>
+        <w:rPr>
+          <w:lang w:val="de-DE"/>
+        </w:rPr>
+        <w:t>lists</w:t>
+      </w:r>
+      <w:proofErr w:type="spellEnd"/>
+      <w:r>
+        <w:rPr>
+          <w:lang w:val="de-DE"/>
+        </w:rPr>
+        <w:t xml:space="preserve">, </w:t>
+      </w:r>
+      <w:proofErr w:type="spellStart"/>
+      <w:r>
+        <w:rPr>
+          <w:lang w:val="de-DE"/>
+        </w:rPr>
+        <w:t>activeId</w:t>
+      </w:r>
+      <w:proofErr w:type="spellEnd"/>
+      <w:r>
+        <w:rPr>
+          <w:lang w:val="de-DE"/>
+        </w:rPr>
+        <w:t xml:space="preserve">) aufgerufen. Als Parameter werden die Aktuellen Einkaufslisten und die ID der aktuell ausgewählten Liste übergeben. Diese werden mit </w:t>
+      </w:r>
+      <w:proofErr w:type="spellStart"/>
+      <w:r>
+        <w:rPr>
+          <w:lang w:val="de-DE"/>
+        </w:rPr>
+        <w:t>JSON.stringify</w:t>
+      </w:r>
+      <w:proofErr w:type="spellEnd"/>
+      <w:r>
+        <w:rPr>
+          <w:lang w:val="de-DE"/>
+        </w:rPr>
+        <w:t xml:space="preserve">() in einen String umgewandelt und </w:t>
+      </w:r>
+      <w:proofErr w:type="spellStart"/>
+      <w:r>
+        <w:rPr>
+          <w:lang w:val="de-DE"/>
+        </w:rPr>
+        <w:t>anschliessend</w:t>
+      </w:r>
+      <w:proofErr w:type="spellEnd"/>
+      <w:r>
+        <w:rPr>
+          <w:lang w:val="de-DE"/>
+        </w:rPr>
+        <w:t xml:space="preserve"> mit </w:t>
+      </w:r>
+      <w:proofErr w:type="spellStart"/>
+      <w:r>
+        <w:rPr>
+          <w:lang w:val="de-DE"/>
+        </w:rPr>
+        <w:t>localStorage.setItem</w:t>
+      </w:r>
+      <w:proofErr w:type="spellEnd"/>
+      <w:r>
+        <w:rPr>
+          <w:lang w:val="de-DE"/>
+        </w:rPr>
+        <w:t xml:space="preserve">() im Browser gespeichert. </w:t>
+      </w:r>
+    </w:p>
+    <w:p>
+      <w:pPr>
+        <w:rPr>
+          <w:lang w:val="de-DE"/>
+        </w:rPr>
+      </w:pPr>
+      <w:r>
+        <w:rPr>
+          <w:lang w:val="de-DE"/>
+        </w:rPr>
+        <w:t xml:space="preserve">Wenn der Benutzer auf „Produkt hinzufügen“ klickt, wird ein neues Produkt Objekt erstellt und in den aktuellen React-State der Einkaufsliste eingefügt. Wir haben einen </w:t>
+      </w:r>
+      <w:proofErr w:type="spellStart"/>
+      <w:r>
+        <w:rPr>
+          <w:lang w:val="de-DE"/>
+        </w:rPr>
+        <w:t>useEffect</w:t>
+      </w:r>
+      <w:proofErr w:type="spellEnd"/>
+      <w:r>
+        <w:rPr>
+          <w:lang w:val="de-DE"/>
+        </w:rPr>
+        <w:t xml:space="preserve">, der auf Änderungen von </w:t>
+      </w:r>
+      <w:proofErr w:type="spellStart"/>
+      <w:r>
+        <w:rPr>
+          <w:lang w:val="de-DE"/>
+        </w:rPr>
+        <w:t>lists</w:t>
+      </w:r>
+      <w:proofErr w:type="spellEnd"/>
+      <w:r>
+        <w:rPr>
+          <w:lang w:val="de-DE"/>
+        </w:rPr>
+        <w:t xml:space="preserve"> uns </w:t>
+      </w:r>
+      <w:proofErr w:type="spellStart"/>
+      <w:r>
+        <w:rPr>
+          <w:lang w:val="de-DE"/>
+        </w:rPr>
+        <w:t>activeListId</w:t>
+      </w:r>
+      <w:proofErr w:type="spellEnd"/>
+      <w:r>
+        <w:rPr>
+          <w:lang w:val="de-DE"/>
+        </w:rPr>
+        <w:t xml:space="preserve"> reagiert, indem es </w:t>
+      </w:r>
+      <w:proofErr w:type="spellStart"/>
+      <w:r>
+        <w:rPr>
+          <w:lang w:val="de-DE"/>
+        </w:rPr>
+        <w:t>saveState</w:t>
+      </w:r>
+      <w:proofErr w:type="spellEnd"/>
+      <w:r>
+        <w:rPr>
+          <w:lang w:val="de-DE"/>
+        </w:rPr>
+        <w:t xml:space="preserve"> aufruft.</w:t>
+      </w:r>
+    </w:p>
+    <w:p>
+      <w:pPr>
+        <w:rPr>
+          <w:lang w:val="de-DE"/>
+        </w:rPr>
+      </w:pPr>
+      <w:r>
+        <w:rPr>
+          <w:lang w:val="de-DE"/>
+        </w:rPr>
+        <w:t xml:space="preserve">Der Datenfluss ist: „Produkt hinzufügen“ </w:t>
+      </w:r>
+      <w:r>
+        <w:rPr>
+          <w:lang w:val="de-DE"/>
+        </w:rPr>
+        <w:sym w:font="Wingdings" w:char="F0E0"/>
+      </w:r>
+      <w:r>
+        <w:rPr>
+          <w:lang w:val="de-DE"/>
+        </w:rPr>
+        <w:t xml:space="preserve"> React-State wird geändert </w:t>
+      </w:r>
+      <w:r>
+        <w:rPr>
+          <w:lang w:val="de-DE"/>
+        </w:rPr>
+        <w:sym w:font="Wingdings" w:char="F0E0"/>
+      </w:r>
+      <w:r>
+        <w:rPr>
+          <w:lang w:val="de-DE"/>
+        </w:rPr>
+        <w:t xml:space="preserve"> </w:t>
+      </w:r>
+      <w:proofErr w:type="spellStart"/>
+      <w:r>
+        <w:rPr>
+          <w:lang w:val="de-DE"/>
+        </w:rPr>
+        <w:t>useEffect</w:t>
+      </w:r>
+      <w:proofErr w:type="spellEnd"/>
+      <w:r>
+        <w:rPr>
+          <w:lang w:val="de-DE"/>
+        </w:rPr>
+        <w:t xml:space="preserve"> erkennt die Änderung </w:t>
+      </w:r>
+      <w:r>
+        <w:rPr>
+          <w:lang w:val="de-DE"/>
+        </w:rPr>
+        <w:sym w:font="Wingdings" w:char="F0E0"/>
+      </w:r>
+      <w:r>
+        <w:rPr>
+          <w:lang w:val="de-DE"/>
+        </w:rPr>
+        <w:t xml:space="preserve"> </w:t>
+      </w:r>
+      <w:proofErr w:type="spellStart"/>
+      <w:proofErr w:type="gramStart"/>
+      <w:r>
+        <w:rPr>
+          <w:lang w:val="de-DE"/>
+        </w:rPr>
+        <w:t>saveState</w:t>
+      </w:r>
+      <w:proofErr w:type="spellEnd"/>
+      <w:r>
+        <w:rPr>
+          <w:lang w:val="de-DE"/>
+        </w:rPr>
+        <w:t>(</w:t>
+      </w:r>
+      <w:proofErr w:type="gramEnd"/>
+      <w:r>
+        <w:rPr>
+          <w:lang w:val="de-DE"/>
+        </w:rPr>
+        <w:t xml:space="preserve">) </w:t>
+      </w:r>
+      <w:r>
+        <w:rPr>
+          <w:lang w:val="de-DE"/>
+        </w:rPr>
+        <w:sym w:font="Wingdings" w:char="F0E0"/>
+      </w:r>
+      <w:r>
+        <w:rPr>
+          <w:lang w:val="de-DE"/>
+        </w:rPr>
+        <w:t xml:space="preserve"> </w:t>
+      </w:r>
+      <w:proofErr w:type="spellStart"/>
+      <w:r>
+        <w:rPr>
+          <w:lang w:val="de-DE"/>
+        </w:rPr>
+        <w:t>JSON.stringify</w:t>
+      </w:r>
+      <w:proofErr w:type="spellEnd"/>
+      <w:r>
+        <w:rPr>
+          <w:lang w:val="de-DE"/>
+        </w:rPr>
+        <w:t xml:space="preserve">() </w:t>
+      </w:r>
+      <w:r>
+        <w:rPr>
+          <w:lang w:val="de-DE"/>
+        </w:rPr>
+        <w:sym w:font="Wingdings" w:char="F0E0"/>
+      </w:r>
+      <w:r>
+        <w:rPr>
+          <w:lang w:val="de-DE"/>
+        </w:rPr>
+        <w:t xml:space="preserve"> </w:t>
+      </w:r>
+      <w:proofErr w:type="spellStart"/>
+      <w:r>
+        <w:rPr>
+          <w:lang w:val="de-DE"/>
+        </w:rPr>
+        <w:t>localStorage</w:t>
+      </w:r>
+      <w:proofErr w:type="spellEnd"/>
+    </w:p>
+    <w:p>
+      <w:pPr>
+        <w:rPr>
+          <w:lang w:val="de-DE"/>
+        </w:rPr>
+      </w:pPr>
+      <w:r>
+        <w:rPr>
+          <w:lang w:val="de-DE"/>
+        </w:rPr>
+        <w:t xml:space="preserve">Um statt </w:t>
+      </w:r>
+      <w:proofErr w:type="spellStart"/>
+      <w:r>
+        <w:rPr>
+          <w:lang w:val="de-DE"/>
+        </w:rPr>
+        <w:t>localStorage</w:t>
+      </w:r>
+      <w:proofErr w:type="spellEnd"/>
+      <w:r>
+        <w:rPr>
+          <w:lang w:val="de-DE"/>
+        </w:rPr>
+        <w:t xml:space="preserve"> </w:t>
+      </w:r>
+      <w:proofErr w:type="spellStart"/>
+      <w:r>
+        <w:rPr>
+          <w:lang w:val="de-DE"/>
+        </w:rPr>
+        <w:t>sessionStorage</w:t>
+      </w:r>
+      <w:proofErr w:type="spellEnd"/>
+      <w:r>
+        <w:rPr>
+          <w:lang w:val="de-DE"/>
+        </w:rPr>
+        <w:t xml:space="preserve"> zu verwenden, müsste man in Funktionen </w:t>
+      </w:r>
+      <w:proofErr w:type="spellStart"/>
+      <w:r>
+        <w:rPr>
+          <w:lang w:val="de-DE"/>
+        </w:rPr>
+        <w:t>localStorage</w:t>
+      </w:r>
+      <w:proofErr w:type="spellEnd"/>
+      <w:r>
+        <w:rPr>
+          <w:lang w:val="de-DE"/>
+        </w:rPr>
+        <w:t xml:space="preserve"> durch </w:t>
+      </w:r>
+      <w:proofErr w:type="spellStart"/>
+      <w:r>
+        <w:rPr>
+          <w:lang w:val="de-DE"/>
+        </w:rPr>
+        <w:t>sessionStorage</w:t>
+      </w:r>
+      <w:proofErr w:type="spellEnd"/>
+      <w:r>
+        <w:rPr>
+          <w:lang w:val="de-DE"/>
+        </w:rPr>
+        <w:t xml:space="preserve"> ersetzen z.B. bei </w:t>
+      </w:r>
+      <w:proofErr w:type="spellStart"/>
+      <w:proofErr w:type="gramStart"/>
+      <w:r>
+        <w:rPr>
+          <w:lang w:val="de-DE"/>
+        </w:rPr>
+        <w:t>saveState</w:t>
+      </w:r>
+      <w:proofErr w:type="spellEnd"/>
+      <w:r>
+        <w:rPr>
+          <w:lang w:val="de-DE"/>
+        </w:rPr>
+        <w:t>(</w:t>
+      </w:r>
+      <w:proofErr w:type="gramEnd"/>
+      <w:r>
+        <w:rPr>
+          <w:lang w:val="de-DE"/>
+        </w:rPr>
+        <w:t xml:space="preserve">) würde man </w:t>
+      </w:r>
+      <w:proofErr w:type="spellStart"/>
+      <w:r>
+        <w:rPr>
+          <w:lang w:val="de-DE"/>
+        </w:rPr>
+        <w:t>localStorage.setItem</w:t>
+      </w:r>
+      <w:proofErr w:type="spellEnd"/>
+      <w:r>
+        <w:rPr>
+          <w:lang w:val="de-DE"/>
+        </w:rPr>
+        <w:t xml:space="preserve"> </w:t>
+      </w:r>
+      <w:proofErr w:type="spellStart"/>
+      <w:r>
+        <w:rPr>
+          <w:lang w:val="de-DE"/>
+        </w:rPr>
+        <w:t>surch</w:t>
+      </w:r>
+      <w:proofErr w:type="spellEnd"/>
+      <w:r>
+        <w:rPr>
+          <w:lang w:val="de-DE"/>
+        </w:rPr>
+        <w:t xml:space="preserve"> </w:t>
+      </w:r>
+      <w:proofErr w:type="spellStart"/>
+      <w:r>
+        <w:rPr>
+          <w:lang w:val="de-DE"/>
+        </w:rPr>
+        <w:t>sessionStorage.setItem</w:t>
+      </w:r>
+      <w:proofErr w:type="spellEnd"/>
+      <w:r>
+        <w:rPr>
+          <w:lang w:val="de-DE"/>
+        </w:rPr>
+        <w:t xml:space="preserve"> ersetzen. </w:t>
+      </w:r>
+    </w:p>
+    <w:p>
+      <w:pPr>
+        <w:rPr>
+          <w:lang w:val="de-DE"/>
+        </w:rPr>
+      </w:pPr>
+    </w:p>
+    <w:p>
+      <w:pPr>
+        <w:rPr>
+          <w:lang w:val="de-DE"/>
+        </w:rPr>
+      </w:pPr>
+      <w:r>
+        <w:rPr>
+          <w:lang w:val="de-DE"/>
+        </w:rPr>
+        <w:t>Aufgabe 4</w:t>
+      </w:r>
+    </w:p>
+    <w:p>
+      <w:pPr>
+        <w:rPr>
+          <w:lang w:val="de-DE"/>
+        </w:rPr>
+      </w:pPr>
+      <w:r>
+        <w:rPr>
+          <w:lang w:val="de-DE"/>
+        </w:rPr>
+        <w:t>Technik:</w:t>
+      </w:r>
+    </w:p>
+    <w:p>
+      <w:pPr>
+        <w:rPr>
+          <w:lang w:val="de-DE"/>
+        </w:rPr>
+      </w:pPr>
+      <w:r>
+        <w:rPr>
+          <w:lang w:val="de-DE"/>
         </w:rPr>
         <w:drawing>
-          <wp:inline distT="0" distB="0" distL="0" distR="0" wp14:anchorId="4F598579" wp14:editId="678A9552">
-            <wp:extent cx="1440382" cy="2600421"/>
-            <wp:effectExtent l="0" t="0" r="7620" b="0"/>
-            <wp:docPr id="1596628511" name="Picture 1"/>
+          <wp:inline distT="0" distB="0" distL="0" distR="0" wp14:anchorId="08CEA455" wp14:editId="12F22383">
+            <wp:extent cx="2365897" cy="3168869"/>
+            <wp:effectExtent l="0" t="0" r="0" b="0"/>
+            <wp:docPr id="631495604" name="Picture 1"/>
             <wp:cNvGraphicFramePr>
               <a:graphicFrameLocks xmlns:a="http://schemas.openxmlformats.org/drawingml/2006/main" noChangeAspect="1"/>
             </wp:cNvGraphicFramePr>
@@ -50,7 +635,7 @@
               <a:graphicData uri="http://schemas.openxmlformats.org/drawingml/2006/picture">
                 <pic:pic xmlns:pic="http://schemas.openxmlformats.org/drawingml/2006/picture">
                   <pic:nvPicPr>
-                    <pic:cNvPr id="1596628511" name=""/>
+                    <pic:cNvPr id="631495604" name=""/>
                     <pic:cNvPicPr/>
                   </pic:nvPicPr>
                   <pic:blipFill>
@@ -62,7 +647,7 @@
                   <pic:spPr>
                     <a:xfrm>
                       <a:off x="0" y="0"/>
-                      <a:ext cx="1443198" cy="2605506"/>
+                      <a:ext cx="2375847" cy="3182196"/>
                     </a:xfrm>
                     <a:prstGeom prst="rect">
                       <a:avLst/>
@@ -74,437 +659,336 @@
           </wp:inline>
         </w:drawing>
       </w:r>
-      <w:r>
-        <w:rPr>
-          <w:lang w:val="en-GB"/>
-        </w:rPr>
-        <w:drawing>
-          <wp:inline distT="0" distB="0" distL="0" distR="0" wp14:anchorId="4DCD9297" wp14:editId="27D7A358">
-            <wp:extent cx="1843314" cy="2581359"/>
-            <wp:effectExtent l="0" t="0" r="5080" b="0"/>
-            <wp:docPr id="417431176" name="Picture 1"/>
-            <wp:cNvGraphicFramePr>
-              <a:graphicFrameLocks xmlns:a="http://schemas.openxmlformats.org/drawingml/2006/main" noChangeAspect="1"/>
-            </wp:cNvGraphicFramePr>
-            <a:graphic xmlns:a="http://schemas.openxmlformats.org/drawingml/2006/main">
-              <a:graphicData uri="http://schemas.openxmlformats.org/drawingml/2006/picture">
-                <pic:pic xmlns:pic="http://schemas.openxmlformats.org/drawingml/2006/picture">
-                  <pic:nvPicPr>
-                    <pic:cNvPr id="417431176" name=""/>
-                    <pic:cNvPicPr/>
-                  </pic:nvPicPr>
-                  <pic:blipFill>
-                    <a:blip r:embed="rId6"/>
-                    <a:stretch>
-                      <a:fillRect/>
-                    </a:stretch>
-                  </pic:blipFill>
-                  <pic:spPr>
-                    <a:xfrm>
-                      <a:off x="0" y="0"/>
-                      <a:ext cx="1854581" cy="2597138"/>
-                    </a:xfrm>
-                    <a:prstGeom prst="rect">
-                      <a:avLst/>
-                    </a:prstGeom>
-                  </pic:spPr>
-                </pic:pic>
-              </a:graphicData>
-            </a:graphic>
-          </wp:inline>
-        </w:drawing>
-      </w:r>
     </w:p>
     <w:p>
       <w:pPr>
         <w:rPr>
-          <w:lang w:val="en-GB"/>
-        </w:rPr>
-      </w:pPr>
-      <w:r>
-        <w:rPr>
-          <w:lang w:val="en-GB"/>
-        </w:rPr>
-        <w:t>What I like/ will be implementing</w:t>
+          <w:lang w:val="de-DE"/>
+        </w:rPr>
+      </w:pPr>
+      <w:r>
+        <w:rPr>
+          <w:lang w:val="de-DE"/>
+        </w:rPr>
+        <w:lastRenderedPageBreak/>
+        <w:t xml:space="preserve">Was passiert, wenn zwei Produkte exakt gleich </w:t>
+      </w:r>
+      <w:proofErr w:type="spellStart"/>
+      <w:r>
+        <w:rPr>
+          <w:lang w:val="de-DE"/>
+        </w:rPr>
+        <w:t>heissen</w:t>
+      </w:r>
+      <w:proofErr w:type="spellEnd"/>
+      <w:r>
+        <w:rPr>
+          <w:lang w:val="de-DE"/>
+        </w:rPr>
+        <w:t>?</w:t>
       </w:r>
     </w:p>
     <w:p>
       <w:pPr>
-        <w:pStyle w:val="ListParagraph"/>
-        <w:numPr>
-          <w:ilvl w:val="0"/>
-          <w:numId w:val="1"/>
-        </w:numPr>
-        <w:rPr>
-          <w:lang w:val="en-GB"/>
-        </w:rPr>
-      </w:pPr>
-      <w:r>
-        <w:rPr>
-          <w:lang w:val="en-GB"/>
-        </w:rPr>
-        <w:t xml:space="preserve">List sorted by Item Category </w:t>
+        <w:rPr>
+          <w:lang w:val="de-DE"/>
+        </w:rPr>
+      </w:pPr>
+      <w:r>
+        <w:rPr>
+          <w:lang w:val="de-DE"/>
+        </w:rPr>
+        <w:t xml:space="preserve">Zwei Produkte dürfen gleich </w:t>
+      </w:r>
+      <w:proofErr w:type="spellStart"/>
+      <w:r>
+        <w:rPr>
+          <w:lang w:val="de-DE"/>
+        </w:rPr>
+        <w:t>heissen</w:t>
+      </w:r>
+      <w:proofErr w:type="spellEnd"/>
+      <w:r>
+        <w:rPr>
+          <w:lang w:val="de-DE"/>
+        </w:rPr>
+        <w:t xml:space="preserve">, da der Produkt ID und nicht der Produktname, verwendet wird, um ein Produkt zu identifizieren. </w:t>
       </w:r>
     </w:p>
     <w:p>
       <w:pPr>
-        <w:pStyle w:val="ListParagraph"/>
-        <w:numPr>
-          <w:ilvl w:val="0"/>
-          <w:numId w:val="1"/>
-        </w:numPr>
-        <w:rPr>
-          <w:lang w:val="en-GB"/>
-        </w:rPr>
-      </w:pPr>
-      <w:r>
-        <w:rPr>
-          <w:lang w:val="en-GB"/>
-        </w:rPr>
-        <w:t xml:space="preserve">Price System, will want to add option of idk </w:t>
-      </w:r>
-      <w:proofErr w:type="spellStart"/>
-      <w:r>
-        <w:rPr>
-          <w:lang w:val="en-GB"/>
-        </w:rPr>
-        <w:t>tho</w:t>
-      </w:r>
-      <w:proofErr w:type="spellEnd"/>
+        <w:rPr>
+          <w:lang w:val="de-DE"/>
+        </w:rPr>
+      </w:pPr>
+      <w:r>
+        <w:rPr>
+          <w:lang w:val="de-DE"/>
+        </w:rPr>
+        <w:t>UX/UI:</w:t>
+      </w:r>
     </w:p>
     <w:p>
       <w:pPr>
-        <w:pStyle w:val="ListParagraph"/>
-        <w:numPr>
-          <w:ilvl w:val="0"/>
-          <w:numId w:val="1"/>
-        </w:numPr>
-        <w:rPr>
-          <w:lang w:val="en-GB"/>
-        </w:rPr>
-      </w:pPr>
-      <w:r>
-        <w:rPr>
-          <w:lang w:val="en-GB"/>
-        </w:rPr>
-        <w:t xml:space="preserve">How Many + Unit </w:t>
-      </w:r>
-      <w:proofErr w:type="spellStart"/>
-      <w:r>
-        <w:rPr>
-          <w:lang w:val="en-GB"/>
-        </w:rPr>
-        <w:t>Sytem</w:t>
-      </w:r>
-      <w:proofErr w:type="spellEnd"/>
+        <w:rPr>
+          <w:lang w:val="de-DE"/>
+        </w:rPr>
+      </w:pPr>
+      <w:r>
+        <w:rPr>
+          <w:lang w:val="de-DE"/>
+        </w:rPr>
+        <w:t>Die meisten Punkte der Checkliste sind erfüllt. Unser Tester</w:t>
+      </w:r>
+      <w:r>
+        <w:rPr>
+          <w:lang w:val="de-DE"/>
+        </w:rPr>
+        <w:t xml:space="preserve"> (Kieras Bruder)</w:t>
+      </w:r>
+      <w:r>
+        <w:rPr>
+          <w:lang w:val="de-DE"/>
+        </w:rPr>
+        <w:t xml:space="preserve"> konnte </w:t>
+      </w:r>
+      <w:r>
+        <w:rPr>
+          <w:lang w:val="de-DE"/>
+        </w:rPr>
+        <w:t>ohne Schwierigkeiten</w:t>
+      </w:r>
+      <w:r>
+        <w:rPr>
+          <w:lang w:val="de-DE"/>
+        </w:rPr>
+        <w:t xml:space="preserve"> herausfinden, wie man </w:t>
+      </w:r>
+      <w:r>
+        <w:rPr>
+          <w:lang w:val="de-DE"/>
+        </w:rPr>
+        <w:t>ein Produkt</w:t>
+      </w:r>
+      <w:r>
+        <w:rPr>
+          <w:lang w:val="de-DE"/>
+        </w:rPr>
+        <w:t xml:space="preserve"> </w:t>
+      </w:r>
+      <w:r>
+        <w:rPr>
+          <w:lang w:val="de-DE"/>
+        </w:rPr>
+        <w:t>einfügt</w:t>
+      </w:r>
+      <w:r>
+        <w:rPr>
+          <w:lang w:val="de-DE"/>
+        </w:rPr>
+        <w:t xml:space="preserve">, </w:t>
+      </w:r>
+      <w:r>
+        <w:rPr>
+          <w:lang w:val="de-DE"/>
+        </w:rPr>
+        <w:t>abcheckt, bearbeitet</w:t>
+      </w:r>
+      <w:r>
+        <w:rPr>
+          <w:lang w:val="de-DE"/>
+        </w:rPr>
+        <w:t xml:space="preserve"> und löscht, und schien die Status „</w:t>
+      </w:r>
+      <w:proofErr w:type="spellStart"/>
+      <w:r>
+        <w:rPr>
+          <w:lang w:val="de-DE"/>
+        </w:rPr>
+        <w:t>active</w:t>
+      </w:r>
+      <w:proofErr w:type="spellEnd"/>
+      <w:r>
+        <w:rPr>
+          <w:lang w:val="de-DE"/>
+        </w:rPr>
+        <w:t>“ und „</w:t>
+      </w:r>
+      <w:proofErr w:type="spellStart"/>
+      <w:r>
+        <w:rPr>
+          <w:lang w:val="de-DE"/>
+        </w:rPr>
+        <w:t>checked</w:t>
+      </w:r>
+      <w:proofErr w:type="spellEnd"/>
+      <w:r>
+        <w:rPr>
+          <w:lang w:val="de-DE"/>
+        </w:rPr>
+        <w:t>“ schnell verstanden zu haben. Die App funktioniert auf verschiedenen Bildschirmen und bei unterschiedlichen Tab-</w:t>
+      </w:r>
+      <w:proofErr w:type="spellStart"/>
+      <w:r>
+        <w:rPr>
+          <w:lang w:val="de-DE"/>
+        </w:rPr>
+        <w:t>Grö</w:t>
+      </w:r>
+      <w:r>
+        <w:rPr>
+          <w:lang w:val="de-DE"/>
+        </w:rPr>
+        <w:t>ss</w:t>
+      </w:r>
+      <w:r>
+        <w:rPr>
+          <w:lang w:val="de-DE"/>
+        </w:rPr>
+        <w:t>en</w:t>
+      </w:r>
+      <w:proofErr w:type="spellEnd"/>
+      <w:r>
+        <w:rPr>
+          <w:lang w:val="de-DE"/>
+        </w:rPr>
+        <w:t xml:space="preserve">, </w:t>
+      </w:r>
+      <w:proofErr w:type="spellStart"/>
+      <w:r>
+        <w:rPr>
+          <w:lang w:val="de-DE"/>
+        </w:rPr>
+        <w:t>einschlie</w:t>
+      </w:r>
+      <w:r>
+        <w:rPr>
+          <w:lang w:val="de-DE"/>
+        </w:rPr>
+        <w:t>ss</w:t>
+      </w:r>
+      <w:r>
+        <w:rPr>
+          <w:lang w:val="de-DE"/>
+        </w:rPr>
+        <w:t>lich</w:t>
+      </w:r>
+      <w:proofErr w:type="spellEnd"/>
+      <w:r>
+        <w:rPr>
+          <w:lang w:val="de-DE"/>
+        </w:rPr>
+        <w:t xml:space="preserve"> </w:t>
+      </w:r>
+      <w:r>
+        <w:rPr>
+          <w:lang w:val="de-DE"/>
+        </w:rPr>
+        <w:t>Handy</w:t>
+      </w:r>
+      <w:r>
+        <w:rPr>
+          <w:lang w:val="de-DE"/>
+        </w:rPr>
+        <w:t>. Die Daten werden im lokalen Speicher abgelegt und bleiben somit auch nach einem Neustart des Browsers erhalten.</w:t>
+      </w:r>
     </w:p>
     <w:p>
       <w:pPr>
-        <w:pStyle w:val="ListParagraph"/>
-        <w:numPr>
-          <w:ilvl w:val="0"/>
-          <w:numId w:val="1"/>
-        </w:numPr>
-        <w:rPr>
-          <w:lang w:val="en-GB"/>
-        </w:rPr>
-      </w:pPr>
-      <w:r>
-        <w:rPr>
-          <w:lang w:val="en-GB"/>
-        </w:rPr>
-        <w:t>Simplicity</w:t>
+        <w:rPr>
+          <w:lang w:val="de-DE"/>
+        </w:rPr>
+      </w:pPr>
+      <w:r>
+        <w:rPr>
+          <w:lang w:val="de-DE"/>
+        </w:rPr>
+        <w:t xml:space="preserve">Unser Tester hatte Schwierigkeiten zu verstehen, wie man die Kategorien eines Produkts festlegt, und ging davon aus, dass der Artikel automatisch anhand seiner Eingaben sortiert würde. Als er erkannte, dass dies nicht der Fall war, versuchte er, die Kategorie über die Bearbeitungsfunktion zu ändern, was jedoch nicht funktioniert, da man dort nur den Namen, die Menge und den Preis des Produkts festlegen, </w:t>
+      </w:r>
+      <w:r>
+        <w:rPr>
+          <w:lang w:val="de-DE"/>
+        </w:rPr>
+        <w:t>aber nicht</w:t>
+      </w:r>
+      <w:r>
+        <w:rPr>
+          <w:lang w:val="de-DE"/>
+        </w:rPr>
+        <w:t xml:space="preserve"> die Kategorie ändern kann.</w:t>
       </w:r>
     </w:p>
     <w:p>
       <w:pPr>
         <w:rPr>
-          <w:lang w:val="en-GB"/>
-        </w:rPr>
-      </w:pPr>
-      <w:r>
-        <w:rPr>
-          <w:lang w:val="en-GB"/>
-        </w:rPr>
-        <w:t>What I like/ won't be implementing</w:t>
+          <w:lang w:val="de-DE"/>
+        </w:rPr>
+      </w:pPr>
+      <w:r>
+        <w:rPr>
+          <w:lang w:val="de-DE"/>
+        </w:rPr>
+        <w:t xml:space="preserve">Hätten wir mehr Zeit gehabt, hätten wir die Möglichkeit hinzugefügt, die Kategorie eines Artikels über die Bearbeitungsfunktion zu ändern, und versucht, deutlicher zu machen, wo der Nutzer die Kategorie auswählen soll.  </w:t>
+      </w:r>
+      <w:r>
+        <w:rPr>
+          <w:lang w:val="de-DE"/>
+        </w:rPr>
+        <w:t xml:space="preserve">Wir könnten auch </w:t>
+      </w:r>
+      <w:r>
+        <w:rPr>
+          <w:lang w:val="de-DE"/>
+        </w:rPr>
+        <w:t xml:space="preserve">eine Option „Unsortiert“ für Nutzer hinzuzufügen, die sich nicht mit den Kategorien beschäftigen möchten, anstatt Produkte </w:t>
+      </w:r>
+      <w:proofErr w:type="spellStart"/>
+      <w:r>
+        <w:rPr>
+          <w:lang w:val="de-DE"/>
+        </w:rPr>
+        <w:t>standardmä</w:t>
+      </w:r>
+      <w:r>
+        <w:rPr>
+          <w:lang w:val="de-DE"/>
+        </w:rPr>
+        <w:t>ss</w:t>
+      </w:r>
+      <w:r>
+        <w:rPr>
+          <w:lang w:val="de-DE"/>
+        </w:rPr>
+        <w:t>ig</w:t>
+      </w:r>
+      <w:proofErr w:type="spellEnd"/>
+      <w:r>
+        <w:rPr>
+          <w:lang w:val="de-DE"/>
+        </w:rPr>
+        <w:t xml:space="preserve"> der Kategorie „</w:t>
+      </w:r>
+      <w:proofErr w:type="spellStart"/>
+      <w:r>
+        <w:rPr>
+          <w:lang w:val="de-DE"/>
+        </w:rPr>
+        <w:t>produce</w:t>
+      </w:r>
+      <w:proofErr w:type="spellEnd"/>
+      <w:r>
+        <w:rPr>
+          <w:lang w:val="de-DE"/>
+        </w:rPr>
+        <w:t>“ zuzuordnen. Hätten wir noch mehr Zeit, wäre es eine interessante Herausforderung, eine Funktion hinzuzufügen, die das Produkt automatisch anhand des eingegebenen Namens kategorisiert.</w:t>
       </w:r>
     </w:p>
     <w:p>
       <w:pPr>
-        <w:pStyle w:val="ListParagraph"/>
-        <w:numPr>
-          <w:ilvl w:val="0"/>
-          <w:numId w:val="1"/>
-        </w:numPr>
-        <w:rPr>
-          <w:lang w:val="en-GB"/>
-        </w:rPr>
-      </w:pPr>
-      <w:r>
-        <w:rPr>
-          <w:lang w:val="en-GB"/>
-        </w:rPr>
-        <w:t>Barcode Scanner -&gt; not needed for this project</w:t>
-      </w:r>
-    </w:p>
-    <w:p>
-      <w:pPr>
-        <w:rPr>
-          <w:lang w:val="en-GB"/>
-        </w:rPr>
-      </w:pPr>
-      <w:r>
-        <w:rPr>
-          <w:noProof/>
-          <w:lang w:val="en-GB"/>
-        </w:rPr>
-        <mc:AlternateContent>
-          <mc:Choice Requires="wpi">
-            <w:drawing>
-              <wp:anchor distT="0" distB="0" distL="114300" distR="114300" simplePos="0" relativeHeight="251664384" behindDoc="0" locked="0" layoutInCell="1" allowOverlap="1" wp14:anchorId="150D4DC7" wp14:editId="3CEE2CE1">
-                <wp:simplePos x="0" y="0"/>
-                <wp:positionH relativeFrom="column">
-                  <wp:posOffset>9950473</wp:posOffset>
-                </wp:positionH>
-                <wp:positionV relativeFrom="paragraph">
-                  <wp:posOffset>398373</wp:posOffset>
-                </wp:positionV>
-                <wp:extent cx="360" cy="360"/>
-                <wp:effectExtent l="57150" t="57150" r="76200" b="76200"/>
-                <wp:wrapNone/>
-                <wp:docPr id="62011511" name="Ink 14"/>
-                <wp:cNvGraphicFramePr/>
-                <a:graphic xmlns:a="http://schemas.openxmlformats.org/drawingml/2006/main">
-                  <a:graphicData uri="http://schemas.microsoft.com/office/word/2010/wordprocessingInk">
-                    <w14:contentPart bwMode="auto" r:id="rId7">
-                      <w14:nvContentPartPr>
-                        <w14:cNvContentPartPr/>
-                      </w14:nvContentPartPr>
-                      <w14:xfrm>
-                        <a:off x="0" y="0"/>
-                        <a:ext cx="360" cy="360"/>
-                      </w14:xfrm>
-                    </w14:contentPart>
-                  </a:graphicData>
-                </a:graphic>
-              </wp:anchor>
-            </w:drawing>
-          </mc:Choice>
-          <mc:Fallback>
-            <w:pict>
-              <v:shapetype w14:anchorId="02800837" id="_x0000_t75" coordsize="21600,21600" o:spt="75" o:preferrelative="t" path="m@4@5l@4@11@9@11@9@5xe" filled="f" stroked="f">
-                <v:stroke joinstyle="miter"/>
-                <v:formulas>
-                  <v:f eqn="if lineDrawn pixelLineWidth 0"/>
-                  <v:f eqn="sum @0 1 0"/>
-                  <v:f eqn="sum 0 0 @1"/>
-                  <v:f eqn="prod @2 1 2"/>
-                  <v:f eqn="prod @3 21600 pixelWidth"/>
-                  <v:f eqn="prod @3 21600 pixelHeight"/>
-                  <v:f eqn="sum @0 0 1"/>
-                  <v:f eqn="prod @6 1 2"/>
-                  <v:f eqn="prod @7 21600 pixelWidth"/>
-                  <v:f eqn="sum @8 21600 0"/>
-                  <v:f eqn="prod @7 21600 pixelHeight"/>
-                  <v:f eqn="sum @10 21600 0"/>
-                </v:formulas>
-                <v:path o:extrusionok="f" gradientshapeok="t" o:connecttype="rect"/>
-                <o:lock v:ext="edit" aspectratio="t"/>
-              </v:shapetype>
-              <v:shape id="Ink 14" o:spid="_x0000_s1026" type="#_x0000_t75" style="position:absolute;margin-left:782.1pt;margin-top:29.95pt;width:2.9pt;height:2.9pt;z-index:251664384;visibility:visible;mso-wrap-style:square;mso-wrap-distance-left:9pt;mso-wrap-distance-top:0;mso-wrap-distance-right:9pt;mso-wrap-distance-bottom:0;mso-position-horizontal:absolute;mso-position-horizontal-relative:text;mso-position-vertical:absolute;mso-position-vertical-relative:text" o:gfxdata="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">
-                <v:imagedata r:id="rId8" o:title=""/>
-              </v:shape>
-            </w:pict>
-          </mc:Fallback>
-        </mc:AlternateContent>
-      </w:r>
-      <w:r>
-        <w:rPr>
-          <w:lang w:val="en-GB"/>
-        </w:rPr>
-        <w:t>What I dislike/ won't be implementing</w:t>
-      </w:r>
-    </w:p>
-    <w:p>
-      <w:pPr>
-        <w:pStyle w:val="ListParagraph"/>
-        <w:numPr>
-          <w:ilvl w:val="0"/>
-          <w:numId w:val="1"/>
-        </w:numPr>
-        <w:rPr>
-          <w:lang w:val="en-GB"/>
-        </w:rPr>
-      </w:pPr>
-      <w:proofErr w:type="spellStart"/>
-      <w:r>
-        <w:rPr>
-          <w:lang w:val="en-GB"/>
-        </w:rPr>
-        <w:t>Color</w:t>
-      </w:r>
-      <w:proofErr w:type="spellEnd"/>
-      <w:r>
-        <w:rPr>
-          <w:lang w:val="en-GB"/>
-        </w:rPr>
-        <w:t xml:space="preserve"> choice </w:t>
-      </w:r>
-    </w:p>
-    <w:p>
-      <w:pPr>
-        <w:pStyle w:val="ListParagraph"/>
-        <w:numPr>
-          <w:ilvl w:val="0"/>
-          <w:numId w:val="1"/>
-        </w:numPr>
-        <w:rPr>
-          <w:lang w:val="en-GB"/>
-        </w:rPr>
-      </w:pPr>
-      <w:r>
-        <w:rPr>
-          <w:lang w:val="en-GB"/>
-        </w:rPr>
-        <w:t xml:space="preserve">This thing </w:t>
-      </w:r>
-      <w:r>
-        <w:rPr>
-          <w:lang w:val="en-GB"/>
-        </w:rPr>
-        <w:sym w:font="Wingdings" w:char="F0E0"/>
-      </w:r>
-    </w:p>
-    <w:p>
-      <w:pPr>
-        <w:pStyle w:val="ListParagraph"/>
-        <w:rPr>
-          <w:lang w:val="en-GB"/>
-        </w:rPr>
-      </w:pPr>
-      <w:r>
-        <w:rPr>
-          <w:noProof/>
-          <w:lang w:val="en-GB"/>
-        </w:rPr>
-        <mc:AlternateContent>
-          <mc:Choice Requires="wpi">
-            <w:drawing>
-              <wp:anchor distT="0" distB="0" distL="114300" distR="114300" simplePos="0" relativeHeight="251663360" behindDoc="0" locked="0" layoutInCell="1" allowOverlap="1" wp14:anchorId="093535E9" wp14:editId="762EBF1C">
-                <wp:simplePos x="0" y="0"/>
-                <wp:positionH relativeFrom="column">
-                  <wp:posOffset>1258570</wp:posOffset>
-                </wp:positionH>
-                <wp:positionV relativeFrom="paragraph">
-                  <wp:posOffset>44450</wp:posOffset>
-                </wp:positionV>
-                <wp:extent cx="979840" cy="442595"/>
-                <wp:effectExtent l="76200" t="57150" r="67945" b="71755"/>
-                <wp:wrapNone/>
-                <wp:docPr id="319330267" name="Ink 13"/>
-                <wp:cNvGraphicFramePr/>
-                <a:graphic xmlns:a="http://schemas.openxmlformats.org/drawingml/2006/main">
-                  <a:graphicData uri="http://schemas.microsoft.com/office/word/2010/wordprocessingInk">
-                    <w14:contentPart bwMode="auto" r:id="rId9">
-                      <w14:nvContentPartPr>
-                        <w14:cNvContentPartPr/>
-                      </w14:nvContentPartPr>
-                      <w14:xfrm>
-                        <a:off x="0" y="0"/>
-                        <a:ext cx="979840" cy="442595"/>
-                      </w14:xfrm>
-                    </w14:contentPart>
-                  </a:graphicData>
-                </a:graphic>
-              </wp:anchor>
-            </w:drawing>
-          </mc:Choice>
-          <mc:Fallback>
-            <w:pict>
-              <v:shape w14:anchorId="5539FBFE" id="Ink 13" o:spid="_x0000_s1026" type="#_x0000_t75" style="position:absolute;margin-left:97.7pt;margin-top:2.1pt;width:79.95pt;height:37.65pt;z-index:251663360;visibility:visible;mso-wrap-style:square;mso-wrap-distance-left:9pt;mso-wrap-distance-top:0;mso-wrap-distance-right:9pt;mso-wrap-distance-bottom:0;mso-position-horizontal:absolute;mso-position-horizontal-relative:text;mso-position-vertical:absolute;mso-position-vertical-relative:text" o:gfxdata="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">
-                <v:imagedata r:id="rId10" o:title=""/>
-              </v:shape>
-            </w:pict>
-          </mc:Fallback>
-        </mc:AlternateContent>
-      </w:r>
-      <w:r>
-        <w:rPr>
-          <w:lang w:val="en-GB"/>
-        </w:rPr>
-        <w:t xml:space="preserve">  </w:t>
-      </w:r>
-      <w:r>
-        <w:rPr>
-          <w:lang w:val="en-GB"/>
-        </w:rPr>
-        <w:drawing>
-          <wp:inline distT="0" distB="0" distL="0" distR="0" wp14:anchorId="538337F8" wp14:editId="7BA84594">
-            <wp:extent cx="701040" cy="932984"/>
-            <wp:effectExtent l="0" t="0" r="3810" b="635"/>
-            <wp:docPr id="1243425939" name="Picture 1"/>
-            <wp:cNvGraphicFramePr>
-              <a:graphicFrameLocks xmlns:a="http://schemas.openxmlformats.org/drawingml/2006/main" noChangeAspect="1"/>
-            </wp:cNvGraphicFramePr>
-            <a:graphic xmlns:a="http://schemas.openxmlformats.org/drawingml/2006/main">
-              <a:graphicData uri="http://schemas.openxmlformats.org/drawingml/2006/picture">
-                <pic:pic xmlns:pic="http://schemas.openxmlformats.org/drawingml/2006/picture">
-                  <pic:nvPicPr>
-                    <pic:cNvPr id="1243425939" name=""/>
-                    <pic:cNvPicPr/>
-                  </pic:nvPicPr>
-                  <pic:blipFill>
-                    <a:blip r:embed="rId11"/>
-                    <a:stretch>
-                      <a:fillRect/>
-                    </a:stretch>
-                  </pic:blipFill>
-                  <pic:spPr>
-                    <a:xfrm>
-                      <a:off x="0" y="0"/>
-                      <a:ext cx="702620" cy="935086"/>
-                    </a:xfrm>
-                    <a:prstGeom prst="rect">
-                      <a:avLst/>
-                    </a:prstGeom>
-                  </pic:spPr>
-                </pic:pic>
-              </a:graphicData>
-            </a:graphic>
-          </wp:inline>
-        </w:drawing>
-      </w:r>
-    </w:p>
-    <w:p>
-      <w:pPr>
-        <w:rPr>
-          <w:lang w:val="en-GB"/>
-        </w:rPr>
-      </w:pPr>
-      <w:r>
-        <w:rPr>
-          <w:lang w:val="en-GB"/>
-        </w:rPr>
-        <w:t>My additions</w:t>
-      </w:r>
-    </w:p>
-    <w:p>
-      <w:pPr>
-        <w:pStyle w:val="ListParagraph"/>
-        <w:numPr>
-          <w:ilvl w:val="0"/>
-          <w:numId w:val="1"/>
-        </w:numPr>
-        <w:rPr>
-          <w:lang w:val="en-GB"/>
-        </w:rPr>
-      </w:pPr>
-      <w:r>
-        <w:rPr>
-          <w:lang w:val="en-GB"/>
-        </w:rPr>
-        <w:t>upload image of product</w:t>
-      </w:r>
+        <w:rPr>
+          <w:lang w:val="de-DE"/>
+        </w:rPr>
+      </w:pPr>
     </w:p>
     <w:sectPr>
       <w:pgSz w:w="11906" w:h="16838"/>
@@ -1557,64 +2041,6 @@
 </w:styles>
 </file>
 
-<file path=word/ink/ink1.xml><?xml version="1.0" encoding="utf-8"?>
-<inkml:ink xmlns:inkml="http://www.w3.org/2003/InkML">
-  <inkml:definitions>
-    <inkml:context xml:id="ctx0">
-      <inkml:inkSource xml:id="inkSrc0">
-        <inkml:traceFormat>
-          <inkml:channel name="X" type="integer" min="-2.14748E9" max="2.14748E9" units="cm"/>
-          <inkml:channel name="Y" type="integer" min="-2.14748E9" max="2.14748E9" units="cm"/>
-          <inkml:channel name="F" type="integer" max="32767" units="dev"/>
-        </inkml:traceFormat>
-        <inkml:channelProperties>
-          <inkml:channelProperty channel="X" name="resolution" value="1000" units="1/cm"/>
-          <inkml:channelProperty channel="Y" name="resolution" value="1000" units="1/cm"/>
-          <inkml:channelProperty channel="F" name="resolution" value="0" units="1/dev"/>
-        </inkml:channelProperties>
-      </inkml:inkSource>
-      <inkml:timestamp xml:id="ts0" timeString="2026-09-14T13:10:25.347"/>
-    </inkml:context>
-    <inkml:brush xml:id="br0">
-      <inkml:brushProperty name="width" value="0.1" units="cm"/>
-      <inkml:brushProperty name="height" value="0.1" units="cm"/>
-      <inkml:brushProperty name="color" value="#E71224"/>
-    </inkml:brush>
-  </inkml:definitions>
-  <inkml:trace contextRef="#ctx0" brushRef="#br0">1 1 24575,'0'0'-8191</inkml:trace>
-</inkml:ink>
-</file>
-
-<file path=word/ink/ink2.xml><?xml version="1.0" encoding="utf-8"?>
-<inkml:ink xmlns:inkml="http://www.w3.org/2003/InkML">
-  <inkml:definitions>
-    <inkml:context xml:id="ctx0">
-      <inkml:inkSource xml:id="inkSrc0">
-        <inkml:traceFormat>
-          <inkml:channel name="X" type="integer" min="-2.14748E9" max="2.14748E9" units="cm"/>
-          <inkml:channel name="Y" type="integer" min="-2.14748E9" max="2.14748E9" units="cm"/>
-          <inkml:channel name="F" type="integer" max="32767" units="dev"/>
-        </inkml:traceFormat>
-        <inkml:channelProperties>
-          <inkml:channelProperty channel="X" name="resolution" value="1000" units="1/cm"/>
-          <inkml:channelProperty channel="Y" name="resolution" value="1000" units="1/cm"/>
-          <inkml:channelProperty channel="F" name="resolution" value="0" units="1/dev"/>
-        </inkml:channelProperties>
-      </inkml:inkSource>
-      <inkml:timestamp xml:id="ts0" timeString="2026-09-14T13:10:17.544"/>
-    </inkml:context>
-    <inkml:brush xml:id="br0">
-      <inkml:brushProperty name="width" value="0.1" units="cm"/>
-      <inkml:brushProperty name="height" value="0.1" units="cm"/>
-      <inkml:brushProperty name="color" value="#E71224"/>
-    </inkml:brush>
-  </inkml:definitions>
-  <inkml:trace contextRef="#ctx0" brushRef="#br0">708 229 24575,'-14'18'0,"6"-10"0,-307 414 0,213-276 0,-84 120 0,117-154 0,69-112 0,0-1 0,0 1 0,0 0 0,0 0 0,0-1 0,0 1 0,0 0 0,0-1 0,0 1 0,0 0 0,0 0 0,0-1 0,0 1 0,-1 0 0,1 0 0,0-1 0,0 1 0,0 0 0,0 0 0,0-1 0,-1 1 0,1 0 0,0 0 0,0 0 0,0-1 0,-1 1 0,1 0 0,0 0 0,0 0 0,-1 0 0,1 0 0,0-1 0,0 1 0,-1 0 0,1 0 0,0 0 0,0 0 0,-1 0 0,1 0 0,0 0 0,-1 0 0,1 0 0,0 0 0,0 0 0,-1 0 0,1 0 0,0 0 0,-1 0 0,1 1 0,0-1 0,0 0 0,-1 0 0,1 0 0,0 0 0,0 0 0,0 0 0,-1 1 0,1-1 0,0 0 0,0 0 0,0 0 0,-1 1 0,1-1 0,0 0 0,0 1 0,-2-28 0,2 24 0,0-32 0,4-140 0,7 109 0,-7 47 0,-1 0 0,1-21 0,-6 112 0,3 209 0,-1-279 0,1 0 0,-1 1 0,1-1 0,0 0 0,-1 1 0,1-1 0,0 0 0,0 0 0,0 0 0,0 0 0,1 0 0,-1 0 0,1 0 0,-1 0 0,1 0 0,0-1 0,-1 1 0,1-1 0,0 1 0,0-1 0,0 0 0,0 1 0,0-1 0,1 0 0,-1 0 0,0-1 0,0 1 0,1 0 0,-1-1 0,0 0 0,3 1 0,11 0 0,-1 0 0,0 0 0,30-5 0,-15 2 0,3 1 0,-4 1 0,-1-2 0,1 0 0,31-8 0,-25 4-1365,-19 4-5461</inkml:trace>
-  <inkml:trace contextRef="#ctx0" brushRef="#br0" timeOffset="1273.98">1369 100 24575,'8'11'0,"27"29"0,40 44 0,34 40 0,23 21 0,0 4-1007,-8-13 1007,-14-21 0,-19-24 247,-20-24-247,-16-15 0,-14-14 0,-13-9 0,-8-9 0,-4-9 760,-4-2-760,-5 1 0</inkml:trace>
-  <inkml:trace contextRef="#ctx0" brushRef="#br0" timeOffset="3081.3">1242 1188 24575,'3'-2'0,"0"0"0,0 0 0,0 0 0,1 0 0,-1 1 0,0-1 0,7-1 0,14-7 0,358-239 0,-180 102 0,209-197 0,-334 273 0,187-180 0,-238 224-682,35-45-1</inkml:trace>
-</inkml:ink>
-</file>
-
 <file path=word/theme/theme1.xml><?xml version="1.0" encoding="utf-8"?>
 <a:theme xmlns:a="http://schemas.openxmlformats.org/drawingml/2006/main" name="Office Theme">
   <a:themeElements>

</xml_diff>